<commit_message>
Add Cameroon NACAM elasticity analysis and outputs
</commit_message>
<xml_diff>
--- a/Analytics - trade and jobs - Cameroon.docx
+++ b/Analytics - trade and jobs - Cameroon.docx
@@ -67,7 +67,25 @@
           <w:sz w:val="22"/>
           <w:szCs w:val="22"/>
         </w:rPr>
-        <w:t>This activity generates the employment evidence base needed to inform the implementation of current and future lending operations across the corridor and financial sector portfolio. The Douala-Bangui Economic Corridor Project's implementation choices — which value chains to support, which investor profiles to prioritize, where to concentrate facilitation efforts — require a prior understanding of where employment multipliers are concentrated. Similarly, the Cameroon Finance for Jobs, Inclusion and Growth project, a $200M operation in pipeline for FY2027, can amplify its development impact by channeling MSME financing toward firms with demonstrated high employment elasticities. Drawing on Enterprise Survey data and national firm registries across Cameroon, Gabon, and Equatorial Guinea, the activity provides corridor teams, investment promotion agencies, and financial sector practitioners with an empirical foundation for targeting decisions that are currently made on intuitive grounds.</w:t>
+        <w:t xml:space="preserve">This activity generates the employment </w:t>
+      </w:r>
+      <w:proofErr w:type="gramStart"/>
+      <w:r>
+        <w:rPr>
+          <w:rFonts w:ascii="Calibri" w:hAnsi="Calibri" w:cs="Calibri"/>
+          <w:sz w:val="22"/>
+          <w:szCs w:val="22"/>
+        </w:rPr>
+        <w:t>evidence base</w:t>
+      </w:r>
+      <w:proofErr w:type="gramEnd"/>
+      <w:r>
+        <w:rPr>
+          <w:rFonts w:ascii="Calibri" w:hAnsi="Calibri" w:cs="Calibri"/>
+          <w:sz w:val="22"/>
+          <w:szCs w:val="22"/>
+        </w:rPr>
+        <w:t xml:space="preserve"> needed to inform the implementation of current and future lending operations across the corridor and financial sector portfolio. The Douala-Bangui Economic Corridor Project's implementation choices — which value chains to support, which investor profiles to prioritize, where to concentrate facilitation efforts — require a prior understanding of where employment multipliers are concentrated. Similarly, the Cameroon Finance for Jobs, Inclusion and Growth project, a $200M operation in pipeline for FY2027, can amplify its development impact by channeling MSME financing toward firms with demonstrated high employment elasticities. Drawing on Enterprise Survey data and national firm registries across Cameroon, Gabon, and Equatorial Guinea, the activity provides corridor teams, investment promotion agencies, and financial sector practitioners with an empirical foundation for targeting decisions that are currently made on intuitive grounds.</w:t>
       </w:r>
       <w:r>
         <w:rPr>
@@ -117,7 +135,59 @@
           <w:sz w:val="22"/>
           <w:szCs w:val="22"/>
         </w:rPr>
-        <w:t>Not all growth is equal from an employment perspective. A dollar of output in oil and gas creates a fraction of the jobs generated by the same dollar in agro-processing or light manufacturing. This phase estimates sectoral employment elasticities — the percentage change in employment for a one percent increase in sectoral output — using cross-sectional regression analysis on firm-level data from Enterprise Surveys and national firm registries across Cameroon, Gabon, and Equatorial Guinea. Elasticities are estimated at the sub-sector level, enabling a granular comparison across tradable and non-tradable activities that is directly relevant to the productive corridor zones along Douala–N'Djamena and Douala–Bangui.</w:t>
+        <w:t xml:space="preserve">Not all growth is equal from an employment perspective. A dollar of output in oil and gas creates a fraction of the jobs generated by the same dollar in </w:t>
+      </w:r>
+      <w:proofErr w:type="spellStart"/>
+      <w:r>
+        <w:rPr>
+          <w:rFonts w:ascii="Calibri" w:hAnsi="Calibri" w:cs="Calibri"/>
+          <w:sz w:val="22"/>
+          <w:szCs w:val="22"/>
+        </w:rPr>
+        <w:t>agro</w:t>
+      </w:r>
+      <w:proofErr w:type="spellEnd"/>
+      <w:r>
+        <w:rPr>
+          <w:rFonts w:ascii="Calibri" w:hAnsi="Calibri" w:cs="Calibri"/>
+          <w:sz w:val="22"/>
+          <w:szCs w:val="22"/>
+        </w:rPr>
+        <w:t xml:space="preserve">-processing or light manufacturing. This phase estimates </w:t>
+      </w:r>
+      <w:r>
+        <w:rPr>
+          <w:rFonts w:ascii="Calibri" w:hAnsi="Calibri" w:cs="Calibri"/>
+          <w:sz w:val="22"/>
+          <w:szCs w:val="22"/>
+          <w:highlight w:val="yellow"/>
+        </w:rPr>
+        <w:t>sectoral employment elasticities</w:t>
+      </w:r>
+      <w:r>
+        <w:rPr>
+          <w:rFonts w:ascii="Calibri" w:hAnsi="Calibri" w:cs="Calibri"/>
+          <w:sz w:val="22"/>
+          <w:szCs w:val="22"/>
+        </w:rPr>
+        <w:t xml:space="preserve"> — the percentage change in employment for a one percent increase in sectoral output — using cross-sectional regression analysis on firm-level data from Enterprise Surveys and national firm registries across </w:t>
+      </w:r>
+      <w:r>
+        <w:rPr>
+          <w:rFonts w:ascii="Calibri" w:hAnsi="Calibri" w:cs="Calibri"/>
+          <w:sz w:val="22"/>
+          <w:szCs w:val="22"/>
+          <w:highlight w:val="yellow"/>
+        </w:rPr>
+        <w:t>Cameroon,</w:t>
+      </w:r>
+      <w:r>
+        <w:rPr>
+          <w:rFonts w:ascii="Calibri" w:hAnsi="Calibri" w:cs="Calibri"/>
+          <w:sz w:val="22"/>
+          <w:szCs w:val="22"/>
+        </w:rPr>
+        <w:t xml:space="preserve"> Gabon, and Equatorial Guinea. Elasticities are estimated at the sub-sector level, enabling a granular comparison across tradable and non-tradable activities that is directly relevant to the productive corridor zones along Douala–N'Djamena and Douala–Bangui.</w:t>
       </w:r>
     </w:p>
     <w:p>
@@ -157,7 +227,56 @@
           <w:sz w:val="22"/>
           <w:szCs w:val="22"/>
         </w:rPr>
-        <w:t>Raw elasticities at the sector level conceal important variation across firm types. This phase introduces interaction terms to disaggregate employment intensities by export status, firm size, ownership structure, and geographic location relative to the corridor. The goal is to distinguish the employment intensity of competitive, outward-oriented firms — the kind that corridor infrastructure and zone policies should attract — from that of low-productivity, inward-facing enterprises. This distinction is critical for designing investment promotion incentives that accompany the infrastructure pipeline: the Douala-Bangui corridor project's economic development component should be targeting investment facilitation toward the firm profile with the highest employment multiplier, not simply the largest investment value.</w:t>
+        <w:t xml:space="preserve">Raw elasticities at the sector level conceal important variation across firm types. This phase introduces interaction terms to disaggregate employment intensities </w:t>
+      </w:r>
+      <w:commentRangeStart w:id="0"/>
+      <w:r>
+        <w:rPr>
+          <w:rFonts w:ascii="Calibri" w:hAnsi="Calibri" w:cs="Calibri"/>
+          <w:sz w:val="22"/>
+          <w:szCs w:val="22"/>
+          <w:highlight w:val="yellow"/>
+        </w:rPr>
+        <w:t>by export status, firm size, ownership structure, and geographic location relative to the corridor.</w:t>
+      </w:r>
+      <w:r>
+        <w:rPr>
+          <w:rFonts w:ascii="Calibri" w:hAnsi="Calibri" w:cs="Calibri"/>
+          <w:sz w:val="22"/>
+          <w:szCs w:val="22"/>
+        </w:rPr>
+        <w:t xml:space="preserve"> </w:t>
+      </w:r>
+      <w:commentRangeEnd w:id="0"/>
+      <w:r>
+        <w:rPr>
+          <w:rStyle w:val="CommentReference"/>
+        </w:rPr>
+        <w:commentReference w:id="0"/>
+      </w:r>
+      <w:r>
+        <w:rPr>
+          <w:rFonts w:ascii="Calibri" w:hAnsi="Calibri" w:cs="Calibri"/>
+          <w:sz w:val="22"/>
+          <w:szCs w:val="22"/>
+        </w:rPr>
+        <w:t xml:space="preserve">The goal is to distinguish the employment intensity of competitive, </w:t>
+      </w:r>
+      <w:r>
+        <w:rPr>
+          <w:rFonts w:ascii="Calibri" w:hAnsi="Calibri" w:cs="Calibri"/>
+          <w:sz w:val="22"/>
+          <w:szCs w:val="22"/>
+        </w:rPr>
+        <w:t>outward-oriented firms</w:t>
+      </w:r>
+      <w:r>
+        <w:rPr>
+          <w:rFonts w:ascii="Calibri" w:hAnsi="Calibri" w:cs="Calibri"/>
+          <w:sz w:val="22"/>
+          <w:szCs w:val="22"/>
+        </w:rPr>
+        <w:t xml:space="preserve"> — the kind that corridor infrastructure and zone policies should attract — from that of low-productivity, inward-facing enterprises. This distinction is critical for designing investment promotion incentives that accompany the infrastructure pipeline: the Douala-Bangui corridor project's economic development component should be targeting investment facilitation toward the firm profile with the highest employment multiplier, not simply the largest investment value.</w:t>
       </w:r>
     </w:p>
     <w:p>
@@ -207,7 +326,42 @@
           <w:sz w:val="22"/>
           <w:szCs w:val="22"/>
         </w:rPr>
-        <w:t xml:space="preserve">Identifying which sectors generate the most employment per unit of output is only useful if paired with an understanding of why firms in those sectors are not already growing faster. This phase uses Enterprise Survey microdata and B-READY scores to map the business environment barriers constraining growth in the high-elasticity sectors identified in Phases I and II. The analysis distinguishes between two categories of constraints. Horizontal constraints — firm registration, access to finance, dispute resolution, labor regulations — apply broadly across sectors and firm types, and their reform generates economy-wide gains regardless of sector prioritization. Sector-specific constraints, by contrast, are particular to the operating conditions of individual value chains: electricity reliability for agro-processors, customs clearance procedures for export-oriented manufacturers, or land titling and permitting for firms seeking to locate along the corridor. By overlaying Enterprise Survey firm-level obstacle data against B-READY's decomposition of regulatory framework, public services, and operational efficiency, the analysis </w:t>
+        <w:t xml:space="preserve">Identifying which sectors generate the most employment per unit of output is only useful if paired with an understanding of why firms in those sectors are not already growing faster. This phase uses </w:t>
+      </w:r>
+      <w:r>
+        <w:rPr>
+          <w:rFonts w:ascii="Calibri" w:hAnsi="Calibri" w:cs="Calibri"/>
+          <w:sz w:val="22"/>
+          <w:szCs w:val="22"/>
+          <w:highlight w:val="yellow"/>
+        </w:rPr>
+        <w:t>Enterprise Survey microdata and B-READY scores to map the business environment barriers constraining growth in the high-elasticity sectors identified in Phases I and II.</w:t>
+      </w:r>
+      <w:r>
+        <w:rPr>
+          <w:rFonts w:ascii="Calibri" w:hAnsi="Calibri" w:cs="Calibri"/>
+          <w:sz w:val="22"/>
+          <w:szCs w:val="22"/>
+        </w:rPr>
+        <w:t xml:space="preserve"> The analysis distinguishes between two categories of constraints. Horizontal constraints — firm registration, access to finance, dispute resolution, labor regulations — apply broadly across sectors and firm types, and their reform generates economy-wide gains regardless of sector prioritization. Sector-specific constraints, by contrast, are particular to the operating conditions of individual value chains: electricity reliability for </w:t>
+      </w:r>
+      <w:proofErr w:type="spellStart"/>
+      <w:r>
+        <w:rPr>
+          <w:rFonts w:ascii="Calibri" w:hAnsi="Calibri" w:cs="Calibri"/>
+          <w:sz w:val="22"/>
+          <w:szCs w:val="22"/>
+        </w:rPr>
+        <w:t>agro</w:t>
+      </w:r>
+      <w:proofErr w:type="spellEnd"/>
+      <w:r>
+        <w:rPr>
+          <w:rFonts w:ascii="Calibri" w:hAnsi="Calibri" w:cs="Calibri"/>
+          <w:sz w:val="22"/>
+          <w:szCs w:val="22"/>
+        </w:rPr>
+        <w:t xml:space="preserve">-processors, customs clearance procedures for export-oriented manufacturers, or land titling and permitting for firms seeking to locate along the corridor. By overlaying Enterprise Survey firm-level obstacle data against B-READY's decomposition of regulatory framework, public services, and operational efficiency, the analysis </w:t>
       </w:r>
       <w:r>
         <w:rPr>
@@ -350,7 +504,25 @@
           <w:sz w:val="22"/>
           <w:szCs w:val="22"/>
         </w:rPr>
-        <w:t>The activity concludes by integrating the employment elasticity estimates from Phases I and II with the constraint diagnostic from Phase III into a reform roadmap. Sectors are ranked by their employment elasticity and the tractability of their binding constraints, and reforms are organized into two tracks: horizontal reforms that improve conditions across all high-potential sectors simultaneously, and sector-specific interventions that address the particular barriers identified in Phase III.</w:t>
+        <w:t xml:space="preserve">The activity concludes by integrating the employment elasticity estimates from Phases I and II with the constraint diagnostic from Phase III into a reform roadmap. Sectors are ranked by their employment elasticity and the tractability of their binding constraints, and reforms are organized into two tracks: horizontal reforms that improve conditions across all high-potential sectors simultaneously, and sector-specific interventions that address the </w:t>
+      </w:r>
+      <w:proofErr w:type="gramStart"/>
+      <w:r>
+        <w:rPr>
+          <w:rFonts w:ascii="Calibri" w:hAnsi="Calibri" w:cs="Calibri"/>
+          <w:sz w:val="22"/>
+          <w:szCs w:val="22"/>
+        </w:rPr>
+        <w:t>particular barriers</w:t>
+      </w:r>
+      <w:proofErr w:type="gramEnd"/>
+      <w:r>
+        <w:rPr>
+          <w:rFonts w:ascii="Calibri" w:hAnsi="Calibri" w:cs="Calibri"/>
+          <w:sz w:val="22"/>
+          <w:szCs w:val="22"/>
+        </w:rPr>
+        <w:t xml:space="preserve"> identified in Phase III.</w:t>
       </w:r>
       <w:r>
         <w:rPr>
@@ -365,9 +537,9 @@
     </w:p>
     <w:p/>
     <w:sectPr>
-      <w:footerReference w:type="even" r:id="rId6"/>
-      <w:footerReference w:type="default" r:id="rId7"/>
-      <w:footerReference w:type="first" r:id="rId8"/>
+      <w:footerReference w:type="even" r:id="rId10"/>
+      <w:footerReference w:type="default" r:id="rId11"/>
+      <w:footerReference w:type="first" r:id="rId12"/>
       <w:pgSz w:w="12240" w:h="15840"/>
       <w:pgMar w:top="1440" w:right="1440" w:bottom="1440" w:left="1440" w:header="720" w:footer="720" w:gutter="0"/>
       <w:cols w:space="720"/>
@@ -375,6 +547,48 @@
     </w:sectPr>
   </w:body>
 </w:document>
+</file>
+
+<file path=word/comments.xml><?xml version="1.0" encoding="utf-8"?>
+<w:comments xmlns:wpc="http://schemas.microsoft.com/office/word/2010/wordprocessingCanvas" xmlns:cx="http://schemas.microsoft.com/office/drawing/2014/chartex" xmlns:cx1="http://schemas.microsoft.com/office/drawing/2015/9/8/chartex" xmlns:cx2="http://schemas.microsoft.com/office/drawing/2015/10/21/chartex" xmlns:cx3="http://schemas.microsoft.com/office/drawing/2016/5/9/chartex" xmlns:cx4="http://schemas.microsoft.com/office/drawing/2016/5/10/chartex" xmlns:cx5="http://schemas.microsoft.com/office/drawing/2016/5/11/chartex" xmlns:cx6="http://schemas.microsoft.com/office/drawing/2016/5/12/chartex" xmlns:cx7="http://schemas.microsoft.com/office/drawing/2016/5/13/chartex" xmlns:cx8="http://schemas.microsoft.com/office/drawing/2016/5/14/chartex" xmlns:mc="http://schemas.openxmlformats.org/markup-compatibility/2006" xmlns:aink="http://schemas.microsoft.com/office/drawing/2016/ink" xmlns:am3d="http://schemas.microsoft.com/office/drawing/2017/model3d" xmlns:o="urn:schemas-microsoft-com:office:office" xmlns:oel="http://schemas.microsoft.com/office/2019/extlst" xmlns:r="http://schemas.openxmlformats.org/officeDocument/2006/relationships" xmlns:m="http://schemas.openxmlformats.org/officeDocument/2006/math" xmlns:v="urn:schemas-microsoft-com:vml" xmlns:wp14="http://schemas.microsoft.com/office/word/2010/wordprocessingDrawing" xmlns:wp="http://schemas.openxmlformats.org/drawingml/2006/wordprocessingDrawing" xmlns:w10="urn:schemas-microsoft-com:office:word" xmlns:w="http://schemas.openxmlformats.org/wordprocessingml/2006/main" xmlns:w14="http://schemas.microsoft.com/office/word/2010/wordml" xmlns:w15="http://schemas.microsoft.com/office/word/2012/wordml" xmlns:w16cex="http://schemas.microsoft.com/office/word/2018/wordml/cex" xmlns:w16cid="http://schemas.microsoft.com/office/word/2016/wordml/cid" xmlns:w16="http://schemas.microsoft.com/office/word/2018/wordml" xmlns:w16du="http://schemas.microsoft.com/office/word/2023/wordml/word16du" xmlns:w16sdtdh="http://schemas.microsoft.com/office/word/2020/wordml/sdtdatahash" xmlns:w16sdtfl="http://schemas.microsoft.com/office/word/2024/wordml/sdtformatlock" xmlns:w16se="http://schemas.microsoft.com/office/word/2015/wordml/symex" xmlns:wpg="http://schemas.microsoft.com/office/word/2010/wordprocessingGroup" xmlns:wpi="http://schemas.microsoft.com/office/word/2010/wordprocessingInk" xmlns:wne="http://schemas.microsoft.com/office/word/2006/wordml" xmlns:wps="http://schemas.microsoft.com/office/word/2010/wordprocessingShape" mc:Ignorable="w14 w15 w16se w16cid w16 w16cex w16sdtdh w16sdtfl w16du wp14">
+  <w:comment w:id="0" w:author="Roldan Manuel Enamorado Irias" w:date="2026-04-08T15:22:00Z" w:initials="RE">
+    <w:p>
+      <w:pPr>
+        <w:pStyle w:val="CommentText"/>
+      </w:pPr>
+      <w:r>
+        <w:rPr>
+          <w:rStyle w:val="CommentReference"/>
+        </w:rPr>
+        <w:annotationRef/>
+      </w:r>
+      <w:r>
+        <w:rPr>
+          <w:lang w:val="es-HN"/>
+        </w:rPr>
+        <w:t>WB projects location</w:t>
+      </w:r>
+    </w:p>
+  </w:comment>
+</w:comments>
+</file>
+
+<file path=word/commentsExtended.xml><?xml version="1.0" encoding="utf-8"?>
+<w15:commentsEx xmlns:wpc="http://schemas.microsoft.com/office/word/2010/wordprocessingCanvas" xmlns:cx="http://schemas.microsoft.com/office/drawing/2014/chartex" xmlns:cx1="http://schemas.microsoft.com/office/drawing/2015/9/8/chartex" xmlns:cx2="http://schemas.microsoft.com/office/drawing/2015/10/21/chartex" xmlns:cx3="http://schemas.microsoft.com/office/drawing/2016/5/9/chartex" xmlns:cx4="http://schemas.microsoft.com/office/drawing/2016/5/10/chartex" xmlns:cx5="http://schemas.microsoft.com/office/drawing/2016/5/11/chartex" xmlns:cx6="http://schemas.microsoft.com/office/drawing/2016/5/12/chartex" xmlns:cx7="http://schemas.microsoft.com/office/drawing/2016/5/13/chartex" xmlns:cx8="http://schemas.microsoft.com/office/drawing/2016/5/14/chartex" xmlns:mc="http://schemas.openxmlformats.org/markup-compatibility/2006" xmlns:aink="http://schemas.microsoft.com/office/drawing/2016/ink" xmlns:am3d="http://schemas.microsoft.com/office/drawing/2017/model3d" xmlns:o="urn:schemas-microsoft-com:office:office" xmlns:oel="http://schemas.microsoft.com/office/2019/extlst" xmlns:r="http://schemas.openxmlformats.org/officeDocument/2006/relationships" xmlns:m="http://schemas.openxmlformats.org/officeDocument/2006/math" xmlns:v="urn:schemas-microsoft-com:vml" xmlns:wp14="http://schemas.microsoft.com/office/word/2010/wordprocessingDrawing" xmlns:wp="http://schemas.openxmlformats.org/drawingml/2006/wordprocessingDrawing" xmlns:w10="urn:schemas-microsoft-com:office:word" xmlns:w="http://schemas.openxmlformats.org/wordprocessingml/2006/main" xmlns:w14="http://schemas.microsoft.com/office/word/2010/wordml" xmlns:w15="http://schemas.microsoft.com/office/word/2012/wordml" xmlns:w16cex="http://schemas.microsoft.com/office/word/2018/wordml/cex" xmlns:w16cid="http://schemas.microsoft.com/office/word/2016/wordml/cid" xmlns:w16="http://schemas.microsoft.com/office/word/2018/wordml" xmlns:w16du="http://schemas.microsoft.com/office/word/2023/wordml/word16du" xmlns:w16sdtdh="http://schemas.microsoft.com/office/word/2020/wordml/sdtdatahash" xmlns:w16sdtfl="http://schemas.microsoft.com/office/word/2024/wordml/sdtformatlock" xmlns:w16se="http://schemas.microsoft.com/office/word/2015/wordml/symex" xmlns:wpg="http://schemas.microsoft.com/office/word/2010/wordprocessingGroup" xmlns:wpi="http://schemas.microsoft.com/office/word/2010/wordprocessingInk" xmlns:wne="http://schemas.microsoft.com/office/word/2006/wordml" xmlns:wps="http://schemas.microsoft.com/office/word/2010/wordprocessingShape" mc:Ignorable="w14 w15 w16se w16cid w16 w16cex w16sdtdh w16sdtfl w16du wp14">
+  <w15:commentEx w15:paraId="19188D15" w15:done="0"/>
+</w15:commentsEx>
+</file>
+
+<file path=word/commentsExtensible.xml><?xml version="1.0" encoding="utf-8"?>
+<w16cex:commentsExtensible xmlns:wpc="http://schemas.microsoft.com/office/word/2010/wordprocessingCanvas" xmlns:cx="http://schemas.microsoft.com/office/drawing/2014/chartex" xmlns:cx1="http://schemas.microsoft.com/office/drawing/2015/9/8/chartex" xmlns:cx2="http://schemas.microsoft.com/office/drawing/2015/10/21/chartex" xmlns:cx3="http://schemas.microsoft.com/office/drawing/2016/5/9/chartex" xmlns:cx4="http://schemas.microsoft.com/office/drawing/2016/5/10/chartex" xmlns:cx5="http://schemas.microsoft.com/office/drawing/2016/5/11/chartex" xmlns:cx6="http://schemas.microsoft.com/office/drawing/2016/5/12/chartex" xmlns:cx7="http://schemas.microsoft.com/office/drawing/2016/5/13/chartex" xmlns:cx8="http://schemas.microsoft.com/office/drawing/2016/5/14/chartex" xmlns:cr="http://schemas.microsoft.com/office/comments/2020/reactions" xmlns:mc="http://schemas.openxmlformats.org/markup-compatibility/2006" xmlns:aink="http://schemas.microsoft.com/office/drawing/2016/ink" xmlns:am3d="http://schemas.microsoft.com/office/drawing/2017/model3d" xmlns:o="urn:schemas-microsoft-com:office:office" xmlns:oel="http://schemas.microsoft.com/office/2019/extlst" xmlns:r="http://schemas.openxmlformats.org/officeDocument/2006/relationships" xmlns:m="http://schemas.openxmlformats.org/officeDocument/2006/math" xmlns:v="urn:schemas-microsoft-com:vml" xmlns:wp14="http://schemas.microsoft.com/office/word/2010/wordprocessingDrawing" xmlns:wp="http://schemas.openxmlformats.org/drawingml/2006/wordprocessingDrawing" xmlns:w10="urn:schemas-microsoft-com:office:word" xmlns:w="http://schemas.openxmlformats.org/wordprocessingml/2006/main" xmlns:w14="http://schemas.microsoft.com/office/word/2010/wordml" xmlns:w15="http://schemas.microsoft.com/office/word/2012/wordml" xmlns:w16cex="http://schemas.microsoft.com/office/word/2018/wordml/cex" xmlns:w16cid="http://schemas.microsoft.com/office/word/2016/wordml/cid" xmlns:w16="http://schemas.microsoft.com/office/word/2018/wordml" xmlns:w16du="http://schemas.microsoft.com/office/word/2023/wordml/word16du" xmlns:w16sdtdh="http://schemas.microsoft.com/office/word/2020/wordml/sdtdatahash" xmlns:w16sdtfl="http://schemas.microsoft.com/office/word/2024/wordml/sdtformatlock" xmlns:w16se="http://schemas.microsoft.com/office/word/2015/wordml/symex" xmlns:wpg="http://schemas.microsoft.com/office/word/2010/wordprocessingGroup" xmlns:wpi="http://schemas.microsoft.com/office/word/2010/wordprocessingInk" xmlns:wne="http://schemas.microsoft.com/office/word/2006/wordml" xmlns:wps="http://schemas.microsoft.com/office/word/2010/wordprocessingShape" mc:Ignorable="w14 w15 w16se w16cid w16 w16cex w16sdtdh w16sdtfl cr w16du wp14">
+  <w16cex:commentExtensible w16cex:durableId="3F7E3648" w16cex:dateUtc="2026-04-08T21:22:00Z"/>
+</w16cex:commentsExtensible>
+</file>
+
+<file path=word/commentsIds.xml><?xml version="1.0" encoding="utf-8"?>
+<w16cid:commentsIds xmlns:wpc="http://schemas.microsoft.com/office/word/2010/wordprocessingCanvas" xmlns:cx="http://schemas.microsoft.com/office/drawing/2014/chartex" xmlns:cx1="http://schemas.microsoft.com/office/drawing/2015/9/8/chartex" xmlns:cx2="http://schemas.microsoft.com/office/drawing/2015/10/21/chartex" xmlns:cx3="http://schemas.microsoft.com/office/drawing/2016/5/9/chartex" xmlns:cx4="http://schemas.microsoft.com/office/drawing/2016/5/10/chartex" xmlns:cx5="http://schemas.microsoft.com/office/drawing/2016/5/11/chartex" xmlns:cx6="http://schemas.microsoft.com/office/drawing/2016/5/12/chartex" xmlns:cx7="http://schemas.microsoft.com/office/drawing/2016/5/13/chartex" xmlns:cx8="http://schemas.microsoft.com/office/drawing/2016/5/14/chartex" xmlns:mc="http://schemas.openxmlformats.org/markup-compatibility/2006" xmlns:aink="http://schemas.microsoft.com/office/drawing/2016/ink" xmlns:am3d="http://schemas.microsoft.com/office/drawing/2017/model3d" xmlns:o="urn:schemas-microsoft-com:office:office" xmlns:oel="http://schemas.microsoft.com/office/2019/extlst" xmlns:r="http://schemas.openxmlformats.org/officeDocument/2006/relationships" xmlns:m="http://schemas.openxmlformats.org/officeDocument/2006/math" xmlns:v="urn:schemas-microsoft-com:vml" xmlns:wp14="http://schemas.microsoft.com/office/word/2010/wordprocessingDrawing" xmlns:wp="http://schemas.openxmlformats.org/drawingml/2006/wordprocessingDrawing" xmlns:w10="urn:schemas-microsoft-com:office:word" xmlns:w="http://schemas.openxmlformats.org/wordprocessingml/2006/main" xmlns:w14="http://schemas.microsoft.com/office/word/2010/wordml" xmlns:w15="http://schemas.microsoft.com/office/word/2012/wordml" xmlns:w16cex="http://schemas.microsoft.com/office/word/2018/wordml/cex" xmlns:w16cid="http://schemas.microsoft.com/office/word/2016/wordml/cid" xmlns:w16="http://schemas.microsoft.com/office/word/2018/wordml" xmlns:w16du="http://schemas.microsoft.com/office/word/2023/wordml/word16du" xmlns:w16sdtdh="http://schemas.microsoft.com/office/word/2020/wordml/sdtdatahash" xmlns:w16sdtfl="http://schemas.microsoft.com/office/word/2024/wordml/sdtformatlock" xmlns:w16se="http://schemas.microsoft.com/office/word/2015/wordml/symex" xmlns:wpg="http://schemas.microsoft.com/office/word/2010/wordprocessingGroup" xmlns:wpi="http://schemas.microsoft.com/office/word/2010/wordprocessingInk" xmlns:wne="http://schemas.microsoft.com/office/word/2006/wordml" xmlns:wps="http://schemas.microsoft.com/office/word/2010/wordprocessingShape" mc:Ignorable="w14 w15 w16se w16cid w16 w16cex w16sdtdh w16sdtfl w16du wp14">
+  <w16cid:commentId w16cid:paraId="19188D15" w16cid:durableId="3F7E3648"/>
+</w16cid:commentsIds>
 </file>
 
 <file path=word/endnotes.xml><?xml version="1.0" encoding="utf-8"?>
@@ -826,6 +1040,14 @@
 </w:footnotes>
 </file>
 
+<file path=word/people.xml><?xml version="1.0" encoding="utf-8"?>
+<w15:people xmlns:wpc="http://schemas.microsoft.com/office/word/2010/wordprocessingCanvas" xmlns:cx="http://schemas.microsoft.com/office/drawing/2014/chartex" xmlns:cx1="http://schemas.microsoft.com/office/drawing/2015/9/8/chartex" xmlns:cx2="http://schemas.microsoft.com/office/drawing/2015/10/21/chartex" xmlns:cx3="http://schemas.microsoft.com/office/drawing/2016/5/9/chartex" xmlns:cx4="http://schemas.microsoft.com/office/drawing/2016/5/10/chartex" xmlns:cx5="http://schemas.microsoft.com/office/drawing/2016/5/11/chartex" xmlns:cx6="http://schemas.microsoft.com/office/drawing/2016/5/12/chartex" xmlns:cx7="http://schemas.microsoft.com/office/drawing/2016/5/13/chartex" xmlns:cx8="http://schemas.microsoft.com/office/drawing/2016/5/14/chartex" xmlns:mc="http://schemas.openxmlformats.org/markup-compatibility/2006" xmlns:aink="http://schemas.microsoft.com/office/drawing/2016/ink" xmlns:am3d="http://schemas.microsoft.com/office/drawing/2017/model3d" xmlns:o="urn:schemas-microsoft-com:office:office" xmlns:oel="http://schemas.microsoft.com/office/2019/extlst" xmlns:r="http://schemas.openxmlformats.org/officeDocument/2006/relationships" xmlns:m="http://schemas.openxmlformats.org/officeDocument/2006/math" xmlns:v="urn:schemas-microsoft-com:vml" xmlns:wp14="http://schemas.microsoft.com/office/word/2010/wordprocessingDrawing" xmlns:wp="http://schemas.openxmlformats.org/drawingml/2006/wordprocessingDrawing" xmlns:w10="urn:schemas-microsoft-com:office:word" xmlns:w="http://schemas.openxmlformats.org/wordprocessingml/2006/main" xmlns:w14="http://schemas.microsoft.com/office/word/2010/wordml" xmlns:w15="http://schemas.microsoft.com/office/word/2012/wordml" xmlns:w16cex="http://schemas.microsoft.com/office/word/2018/wordml/cex" xmlns:w16cid="http://schemas.microsoft.com/office/word/2016/wordml/cid" xmlns:w16="http://schemas.microsoft.com/office/word/2018/wordml" xmlns:w16du="http://schemas.microsoft.com/office/word/2023/wordml/word16du" xmlns:w16sdtdh="http://schemas.microsoft.com/office/word/2020/wordml/sdtdatahash" xmlns:w16sdtfl="http://schemas.microsoft.com/office/word/2024/wordml/sdtformatlock" xmlns:w16se="http://schemas.microsoft.com/office/word/2015/wordml/symex" xmlns:wpg="http://schemas.microsoft.com/office/word/2010/wordprocessingGroup" xmlns:wpi="http://schemas.microsoft.com/office/word/2010/wordprocessingInk" xmlns:wne="http://schemas.microsoft.com/office/word/2006/wordml" xmlns:wps="http://schemas.microsoft.com/office/word/2010/wordprocessingShape" mc:Ignorable="w14 w15 w16se w16cid w16 w16cex w16sdtdh w16sdtfl w16du wp14">
+  <w15:person w15:author="Roldan Manuel Enamorado Irias">
+    <w15:presenceInfo w15:providerId="AD" w15:userId="S::renamoradoirias@worldbank.org::c5837b67-466b-4ec4-9a59-ecff964f59c4"/>
+  </w15:person>
+</w15:people>
+</file>
+
 <file path=word/styles.xml><?xml version="1.0" encoding="utf-8"?>
 <w:styles xmlns:mc="http://schemas.openxmlformats.org/markup-compatibility/2006" xmlns:r="http://schemas.openxmlformats.org/officeDocument/2006/relationships" xmlns:w="http://schemas.openxmlformats.org/wordprocessingml/2006/main" xmlns:w14="http://schemas.microsoft.com/office/word/2010/wordml" xmlns:w15="http://schemas.microsoft.com/office/word/2012/wordml" xmlns:w16cex="http://schemas.microsoft.com/office/word/2018/wordml/cex" xmlns:w16cid="http://schemas.microsoft.com/office/word/2016/wordml/cid" xmlns:w16="http://schemas.microsoft.com/office/word/2018/wordml" xmlns:w16du="http://schemas.microsoft.com/office/word/2023/wordml/word16du" xmlns:w16sdtdh="http://schemas.microsoft.com/office/word/2020/wordml/sdtdatahash" xmlns:w16sdtfl="http://schemas.microsoft.com/office/word/2024/wordml/sdtformatlock" xmlns:w16se="http://schemas.microsoft.com/office/word/2015/wordml/symex" mc:Ignorable="w14 w15 w16se w16cid w16 w16cex w16sdtdh w16sdtfl w16du">
   <w:docDefaults>
@@ -1790,6 +2012,72 @@
     <w:semiHidden/>
     <w:rsid w:val="009F7E01"/>
   </w:style>
+  <w:style w:type="character" w:styleId="CommentReference">
+    <w:name w:val="annotation reference"/>
+    <w:basedOn w:val="DefaultParagraphFont"/>
+    <w:uiPriority w:val="99"/>
+    <w:semiHidden/>
+    <w:unhideWhenUsed/>
+    <w:rsid w:val="00E16E3E"/>
+    <w:rPr>
+      <w:sz w:val="16"/>
+      <w:szCs w:val="16"/>
+    </w:rPr>
+  </w:style>
+  <w:style w:type="paragraph" w:styleId="CommentText">
+    <w:name w:val="annotation text"/>
+    <w:basedOn w:val="Normal"/>
+    <w:link w:val="CommentTextChar"/>
+    <w:uiPriority w:val="99"/>
+    <w:unhideWhenUsed/>
+    <w:rsid w:val="00E16E3E"/>
+    <w:pPr>
+      <w:spacing w:line="240" w:lineRule="auto"/>
+    </w:pPr>
+    <w:rPr>
+      <w:sz w:val="20"/>
+      <w:szCs w:val="20"/>
+    </w:rPr>
+  </w:style>
+  <w:style w:type="character" w:customStyle="1" w:styleId="CommentTextChar">
+    <w:name w:val="Comment Text Char"/>
+    <w:basedOn w:val="DefaultParagraphFont"/>
+    <w:link w:val="CommentText"/>
+    <w:uiPriority w:val="99"/>
+    <w:rsid w:val="00E16E3E"/>
+    <w:rPr>
+      <w:sz w:val="20"/>
+      <w:szCs w:val="20"/>
+    </w:rPr>
+  </w:style>
+  <w:style w:type="paragraph" w:styleId="CommentSubject">
+    <w:name w:val="annotation subject"/>
+    <w:basedOn w:val="CommentText"/>
+    <w:next w:val="CommentText"/>
+    <w:link w:val="CommentSubjectChar"/>
+    <w:uiPriority w:val="99"/>
+    <w:semiHidden/>
+    <w:unhideWhenUsed/>
+    <w:rsid w:val="00E16E3E"/>
+    <w:rPr>
+      <w:b/>
+      <w:bCs/>
+    </w:rPr>
+  </w:style>
+  <w:style w:type="character" w:customStyle="1" w:styleId="CommentSubjectChar">
+    <w:name w:val="Comment Subject Char"/>
+    <w:basedOn w:val="CommentTextChar"/>
+    <w:link w:val="CommentSubject"/>
+    <w:uiPriority w:val="99"/>
+    <w:semiHidden/>
+    <w:rsid w:val="00E16E3E"/>
+    <w:rPr>
+      <w:b/>
+      <w:bCs/>
+      <w:sz w:val="20"/>
+      <w:szCs w:val="20"/>
+    </w:rPr>
+  </w:style>
 </w:styles>
 </file>
 

</xml_diff>